<commit_message>
Rebuild MER figures with ggplot2
</commit_message>
<xml_diff>
--- a/manuscript/journal_submission/marine_environmental_research/rendered/mer_manuscript_blinded_companion_v2.docx
+++ b/manuscript/journal_submission/marine_environmental_research/rendered/mer_manuscript_blinded_companion_v2.docx
@@ -714,8 +714,8 @@
           <w:noProof/>
         </w:rPr>
         <w:drawing>
-          <wp:inline distT="0" distB="0" distL="0" distR="0" wp14:anchorId="2C547FBD" wp14:editId="40B54203">
-            <wp:extent cx="5334000" cy="3111500"/>
+          <wp:inline distT="0" distB="0" distL="0" distR="0" wp14:anchorId="2F8D4FF0" wp14:editId="5B407125">
+            <wp:extent cx="5334000" cy="3111499"/>
             <wp:effectExtent l="0" t="0" r="0" b="0"/>
             <wp:docPr id="22" name="Picture"/>
             <wp:cNvGraphicFramePr/>
@@ -737,7 +737,7 @@
                   <pic:spPr bwMode="auto">
                     <a:xfrm>
                       <a:off x="0" y="0"/>
-                      <a:ext cx="5334000" cy="3111500"/>
+                      <a:ext cx="5334000" cy="3111499"/>
                     </a:xfrm>
                     <a:prstGeom prst="rect">
                       <a:avLst/>
@@ -1068,7 +1068,7 @@
           <w:noProof/>
         </w:rPr>
         <w:drawing>
-          <wp:inline distT="0" distB="0" distL="0" distR="0" wp14:anchorId="04B24A74" wp14:editId="46DF040E">
+          <wp:inline distT="0" distB="0" distL="0" distR="0" wp14:anchorId="524172CE" wp14:editId="33DE24ED">
             <wp:extent cx="5334000" cy="3379816"/>
             <wp:effectExtent l="0" t="0" r="0" b="0"/>
             <wp:docPr id="33" name="Picture"/>
@@ -1791,8 +1791,8 @@
           <w:noProof/>
         </w:rPr>
         <w:drawing>
-          <wp:inline distT="0" distB="0" distL="0" distR="0" wp14:anchorId="74AB6499" wp14:editId="6E3F47C7">
-            <wp:extent cx="5334000" cy="3378200"/>
+          <wp:inline distT="0" distB="0" distL="0" distR="0" wp14:anchorId="6C3B54A3" wp14:editId="3B2AE86D">
+            <wp:extent cx="5334000" cy="3378199"/>
             <wp:effectExtent l="0" t="0" r="0" b="0"/>
             <wp:docPr id="37" name="Picture"/>
             <wp:cNvGraphicFramePr/>
@@ -1814,7 +1814,7 @@
                   <pic:spPr bwMode="auto">
                     <a:xfrm>
                       <a:off x="0" y="0"/>
-                      <a:ext cx="5334000" cy="3378200"/>
+                      <a:ext cx="5334000" cy="3378199"/>
                     </a:xfrm>
                     <a:prstGeom prst="rect">
                       <a:avLst/>
@@ -1889,7 +1889,7 @@
           <w:noProof/>
         </w:rPr>
         <w:drawing>
-          <wp:inline distT="0" distB="0" distL="0" distR="0" wp14:anchorId="0CB1836C" wp14:editId="110B8FE4">
+          <wp:inline distT="0" distB="0" distL="0" distR="0" wp14:anchorId="78237722" wp14:editId="039E55E1">
             <wp:extent cx="5334000" cy="3782290"/>
             <wp:effectExtent l="0" t="0" r="0" b="0"/>
             <wp:docPr id="41" name="Picture"/>
@@ -2420,8 +2420,8 @@
           <w:noProof/>
         </w:rPr>
         <w:drawing>
-          <wp:inline distT="0" distB="0" distL="0" distR="0" wp14:anchorId="039BE683" wp14:editId="0EE6EA69">
-            <wp:extent cx="5334000" cy="1742440"/>
+          <wp:inline distT="0" distB="0" distL="0" distR="0" wp14:anchorId="6C515C65" wp14:editId="08528FB9">
+            <wp:extent cx="5334000" cy="2311400"/>
             <wp:effectExtent l="0" t="0" r="0" b="0"/>
             <wp:docPr id="46" name="Picture"/>
             <wp:cNvGraphicFramePr/>
@@ -2443,7 +2443,7 @@
                   <pic:spPr bwMode="auto">
                     <a:xfrm>
                       <a:off x="0" y="0"/>
-                      <a:ext cx="5334000" cy="1742440"/>
+                      <a:ext cx="5334000" cy="2311400"/>
                     </a:xfrm>
                     <a:prstGeom prst="rect">
                       <a:avLst/>
@@ -3707,7 +3707,7 @@
   <w:abstractNum w:abstractNumId="0" w15:restartNumberingAfterBreak="0">
     <w:nsid w:val="0000A990"/>
     <w:multiLevelType w:val="multilevel"/>
-    <w:tmpl w:val="FB4C2486"/>
+    <w:tmpl w:val="719E16FE"/>
     <w:lvl w:ilvl="0">
       <w:numFmt w:val="bullet"/>
       <w:lvlText w:val=" "/>
@@ -3781,7 +3781,7 @@
       </w:pPr>
     </w:lvl>
   </w:abstractNum>
-  <w:num w:numId="1" w16cid:durableId="1914849915">
+  <w:num w:numId="1" w16cid:durableId="1210189120">
     <w:abstractNumId w:val="0"/>
   </w:num>
 </w:numbering>
@@ -5029,7 +5029,7 @@
     <w:name w:val="header"/>
     <w:basedOn w:val="Normal"/>
     <w:link w:val="HeaderChar"/>
-    <w:rsid w:val="0003692F"/>
+    <w:rsid w:val="00335B10"/>
     <w:pPr>
       <w:tabs>
         <w:tab w:val="center" w:pos="4680"/>
@@ -5042,13 +5042,13 @@
     <w:name w:val="Header Char"/>
     <w:basedOn w:val="DefaultParagraphFont"/>
     <w:link w:val="Header"/>
-    <w:rsid w:val="0003692F"/>
+    <w:rsid w:val="00335B10"/>
   </w:style>
   <w:style w:type="paragraph" w:styleId="Footer">
     <w:name w:val="footer"/>
     <w:basedOn w:val="Normal"/>
     <w:link w:val="FooterChar"/>
-    <w:rsid w:val="0003692F"/>
+    <w:rsid w:val="00335B10"/>
     <w:pPr>
       <w:tabs>
         <w:tab w:val="center" w:pos="4680"/>
@@ -5061,12 +5061,12 @@
     <w:name w:val="Footer Char"/>
     <w:basedOn w:val="DefaultParagraphFont"/>
     <w:link w:val="Footer"/>
-    <w:rsid w:val="0003692F"/>
+    <w:rsid w:val="00335B10"/>
   </w:style>
   <w:style w:type="character" w:styleId="LineNumber">
     <w:name w:val="line number"/>
     <w:basedOn w:val="DefaultParagraphFont"/>
-    <w:rsid w:val="0003692F"/>
+    <w:rsid w:val="00335B10"/>
   </w:style>
 </w:styles>
 </file>

</xml_diff>